<commit_message>
Update repot with captions
</commit_message>
<xml_diff>
--- a/03_Model_Analysis_Diagnostics/Model Analysis and Diagnostic_Report.docx
+++ b/03_Model_Analysis_Diagnostics/Model Analysis and Diagnostic_Report.docx
@@ -20,7 +20,7 @@
           <w:szCs w:val="48"/>
           <w:rtl w:val="0"/>
         </w:rPr>
-        <w:t xml:space="preserve">Predictive modeling for Credit Risk</w:t>
+        <w:t xml:space="preserve">Predictive Modeling for Credit Risk</w:t>
       </w:r>
       <w:r>
         <w:rPr>
@@ -3062,12 +3062,12 @@
           <wp:inline distB="114300" distT="114300" distL="114300" distR="114300">
             <wp:extent cx="13182600" cy="4610100"/>
             <wp:effectExtent b="0" l="0" r="0" t="0"/>
-            <wp:docPr id="5" name="image7.png"/>
+            <wp:docPr id="5" name="image1.png"/>
             <a:graphic>
               <a:graphicData uri="http://schemas.openxmlformats.org/drawingml/2006/picture">
                 <pic:pic>
                   <pic:nvPicPr>
-                    <pic:cNvPr id="0" name="image7.png"/>
+                    <pic:cNvPr id="0" name="image1.png"/>
                     <pic:cNvPicPr preferRelativeResize="0"/>
                   </pic:nvPicPr>
                   <pic:blipFill>
@@ -3099,6 +3099,33 @@
     </w:p>
     <w:p>
       <w:pPr>
+        <w:spacing w:after="160" w:before="40" w:line="240" w:lineRule="auto"/>
+        <w:jc w:val="center"/>
+        <w:rPr>
+          <w:rFonts w:ascii="Calibri" w:cs="Calibri" w:eastAsia="Calibri" w:hAnsi="Calibri"/>
+          <w:color w:val="404040"/>
+        </w:rPr>
+      </w:pPr>
+      <w:r>
+        <w:rPr>
+          <w:rFonts w:ascii="Calibri" w:cs="Calibri" w:eastAsia="Calibri" w:hAnsi="Calibri"/>
+          <w:i w:val="1"/>
+          <w:iCs w:val="1"/>
+          <w:color w:val="555555"/>
+          <w:sz w:val="19"/>
+          <w:szCs w:val="19"/>
+          <w:rtl w:val="0"/>
+        </w:rPr>
+        <w:t xml:space="preserve">Figure 1: ROC Curve (AUC = 0.943) and Precision-Recall Curve (AUC = 0.900)</w:t>
+      </w:r>
+      <w:r>
+        <w:rPr>
+          <w:rtl w:val="0"/>
+        </w:rPr>
+      </w:r>
+    </w:p>
+    <w:p>
+      <w:pPr>
         <w:spacing w:after="80" w:before="80" w:line="240" w:lineRule="auto"/>
         <w:jc w:val="both"/>
         <w:rPr>
@@ -3263,12 +3290,12 @@
           <wp:inline distB="114300" distT="114300" distL="114300" distR="114300">
             <wp:extent cx="13182600" cy="4610100"/>
             <wp:effectExtent b="0" l="0" r="0" t="0"/>
-            <wp:docPr id="6" name="image6.png"/>
+            <wp:docPr id="6" name="image3.png"/>
             <a:graphic>
               <a:graphicData uri="http://schemas.openxmlformats.org/drawingml/2006/picture">
                 <pic:pic>
                   <pic:nvPicPr>
-                    <pic:cNvPr id="0" name="image6.png"/>
+                    <pic:cNvPr id="0" name="image3.png"/>
                     <pic:cNvPicPr preferRelativeResize="0"/>
                   </pic:nvPicPr>
                   <pic:blipFill>
@@ -3296,6 +3323,32 @@
         <w:rPr>
           <w:rtl w:val="0"/>
         </w:rPr>
+      </w:r>
+    </w:p>
+    <w:p>
+      <w:pPr>
+        <w:spacing w:after="160" w:before="40" w:line="240" w:lineRule="auto"/>
+        <w:jc w:val="center"/>
+        <w:rPr>
+          <w:rFonts w:ascii="Calibri" w:cs="Calibri" w:eastAsia="Calibri" w:hAnsi="Calibri"/>
+          <w:i w:val="1"/>
+          <w:iCs w:val="1"/>
+          <w:color w:val="555555"/>
+          <w:sz w:val="19"/>
+          <w:szCs w:val="19"/>
+        </w:rPr>
+      </w:pPr>
+      <w:r>
+        <w:rPr>
+          <w:rFonts w:ascii="Calibri" w:cs="Calibri" w:eastAsia="Calibri" w:hAnsi="Calibri"/>
+          <w:i w:val="1"/>
+          <w:iCs w:val="1"/>
+          <w:color w:val="555555"/>
+          <w:sz w:val="19"/>
+          <w:szCs w:val="19"/>
+          <w:rtl w:val="0"/>
+        </w:rPr>
+        <w:t xml:space="preserve">Figure 2: Calibration Plot (Brier Score = 0.0532) and Predicted Probability Distribution</w:t>
       </w:r>
     </w:p>
     <w:p>
@@ -4158,12 +4211,12 @@
           <wp:inline distB="114300" distT="114300" distL="114300" distR="114300">
             <wp:extent cx="5876925" cy="2240865"/>
             <wp:effectExtent b="0" l="0" r="0" t="0"/>
-            <wp:docPr id="3" name="image1.png"/>
+            <wp:docPr id="3" name="image2.png"/>
             <a:graphic>
               <a:graphicData uri="http://schemas.openxmlformats.org/drawingml/2006/picture">
                 <pic:pic>
                   <pic:nvPicPr>
-                    <pic:cNvPr id="0" name="image1.png"/>
+                    <pic:cNvPr id="0" name="image2.png"/>
                     <pic:cNvPicPr preferRelativeResize="0"/>
                   </pic:nvPicPr>
                   <pic:blipFill>
@@ -4186,6 +4239,33 @@
             </a:graphic>
           </wp:inline>
         </w:drawing>
+      </w:r>
+      <w:r>
+        <w:rPr>
+          <w:rtl w:val="0"/>
+        </w:rPr>
+      </w:r>
+    </w:p>
+    <w:p>
+      <w:pPr>
+        <w:spacing w:after="160" w:before="40" w:line="240" w:lineRule="auto"/>
+        <w:jc w:val="center"/>
+        <w:rPr>
+          <w:rFonts w:ascii="Calibri" w:cs="Calibri" w:eastAsia="Calibri" w:hAnsi="Calibri"/>
+          <w:color w:val="404040"/>
+        </w:rPr>
+      </w:pPr>
+      <w:r>
+        <w:rPr>
+          <w:rFonts w:ascii="Calibri" w:cs="Calibri" w:eastAsia="Calibri" w:hAnsi="Calibri"/>
+          <w:i w:val="1"/>
+          <w:iCs w:val="1"/>
+          <w:color w:val="555555"/>
+          <w:sz w:val="19"/>
+          <w:szCs w:val="19"/>
+          <w:rtl w:val="0"/>
+        </w:rPr>
+        <w:t xml:space="preserve">Figure 3: Confusion Matrices at Thresholds 0.24, 0.50, and 0.75</w:t>
       </w:r>
       <w:r>
         <w:rPr>
@@ -6212,11 +6292,6 @@
         <w:keepNext w:val="0"/>
         <w:keepLines w:val="0"/>
         <w:spacing w:after="80" w:before="240" w:line="240" w:lineRule="auto"/>
-        <w:rPr/>
-      </w:pPr>
-      <w:bookmarkStart w:colFirst="0" w:colLast="0" w:name="_5o81gp8agmx8" w:id="12"/>
-      <w:bookmarkEnd w:id="12"/>
-      <w:r>
         <w:rPr>
           <w:rFonts w:ascii="Calibri" w:cs="Calibri" w:eastAsia="Calibri" w:hAnsi="Calibri"/>
           <w:b w:val="1"/>
@@ -6225,16 +6300,28 @@
           <w:sz w:val="26"/>
           <w:szCs w:val="26"/>
         </w:rPr>
+      </w:pPr>
+      <w:bookmarkStart w:colFirst="0" w:colLast="0" w:name="_5o81gp8agmx8" w:id="12"/>
+      <w:bookmarkEnd w:id="12"/>
+      <w:r>
+        <w:rPr>
+          <w:rFonts w:ascii="Calibri" w:cs="Calibri" w:eastAsia="Calibri" w:hAnsi="Calibri"/>
+          <w:b w:val="1"/>
+          <w:bCs w:val="1"/>
+          <w:color w:val="2e75b6"/>
+          <w:sz w:val="26"/>
+          <w:szCs w:val="26"/>
+        </w:rPr>
         <w:drawing>
           <wp:inline distB="114300" distT="114300" distL="114300" distR="114300">
             <wp:extent cx="6586538" cy="2303385"/>
             <wp:effectExtent b="0" l="0" r="0" t="0"/>
-            <wp:docPr id="7" name="image2.png"/>
+            <wp:docPr id="7" name="image4.png"/>
             <a:graphic>
               <a:graphicData uri="http://schemas.openxmlformats.org/drawingml/2006/picture">
                 <pic:pic>
                   <pic:nvPicPr>
-                    <pic:cNvPr id="0" name="image2.png"/>
+                    <pic:cNvPr id="0" name="image4.png"/>
                     <pic:cNvPicPr preferRelativeResize="0"/>
                   </pic:nvPicPr>
                   <pic:blipFill>
@@ -6266,6 +6353,30 @@
     </w:p>
     <w:p>
       <w:pPr>
+        <w:spacing w:after="160" w:before="40" w:lineRule="auto"/>
+        <w:jc w:val="center"/>
+        <w:rPr>
+          <w:i w:val="1"/>
+          <w:iCs w:val="1"/>
+          <w:color w:val="555555"/>
+          <w:sz w:val="19"/>
+          <w:szCs w:val="19"/>
+        </w:rPr>
+      </w:pPr>
+      <w:r>
+        <w:rPr>
+          <w:i w:val="1"/>
+          <w:iCs w:val="1"/>
+          <w:color w:val="555555"/>
+          <w:sz w:val="19"/>
+          <w:szCs w:val="19"/>
+          <w:rtl w:val="0"/>
+        </w:rPr>
+        <w:t xml:space="preserve">Figure 4: Model Accuracy by Loan Grade and Test Set Distribution by Loan Grade</w:t>
+      </w:r>
+    </w:p>
+    <w:p>
+      <w:pPr>
         <w:spacing w:after="240" w:before="240" w:lineRule="auto"/>
         <w:rPr>
           <w:rFonts w:ascii="Calibri" w:cs="Calibri" w:eastAsia="Calibri" w:hAnsi="Calibri"/>
@@ -6706,23 +6817,17 @@
         <w:rPr/>
       </w:pPr>
       <w:r>
-        <w:rPr>
-          <w:rtl w:val="0"/>
-        </w:rPr>
-        <w:t xml:space="preserve">Asas</w:t>
-      </w:r>
-      <w:r>
         <w:rPr/>
         <w:drawing>
           <wp:inline distB="114300" distT="114300" distL="114300" distR="114300">
             <wp:extent cx="3447181" cy="3239658"/>
             <wp:effectExtent b="0" l="0" r="0" t="0"/>
-            <wp:docPr id="4" name="image4.png"/>
+            <wp:docPr id="4" name="image9.png"/>
             <a:graphic>
               <a:graphicData uri="http://schemas.openxmlformats.org/drawingml/2006/picture">
                 <pic:pic>
                   <pic:nvPicPr>
-                    <pic:cNvPr id="0" name="image4.png"/>
+                    <pic:cNvPr id="0" name="image9.png"/>
                     <pic:cNvPicPr preferRelativeResize="0"/>
                   </pic:nvPicPr>
                   <pic:blipFill>
@@ -6754,8 +6859,21 @@
     </w:p>
     <w:p>
       <w:pPr>
+        <w:spacing w:after="160" w:before="40" w:lineRule="auto"/>
+        <w:jc w:val="center"/>
         <w:rPr/>
       </w:pPr>
+      <w:r>
+        <w:rPr>
+          <w:i w:val="1"/>
+          <w:iCs w:val="1"/>
+          <w:color w:val="555555"/>
+          <w:sz w:val="19"/>
+          <w:szCs w:val="19"/>
+          <w:rtl w:val="0"/>
+        </w:rPr>
+        <w:t xml:space="preserve">Figure 5: SHAP Feature Importance — Default Prediction (Top 15 Features)</w:t>
+      </w:r>
       <w:r>
         <w:rPr>
           <w:rtl w:val="0"/>
@@ -8628,12 +8746,12 @@
           <wp:inline distB="114300" distT="114300" distL="114300" distR="114300">
             <wp:extent cx="5414963" cy="3898773"/>
             <wp:effectExtent b="0" l="0" r="0" t="0"/>
-            <wp:docPr id="1" name="image9.png"/>
+            <wp:docPr id="1" name="image8.png"/>
             <a:graphic>
               <a:graphicData uri="http://schemas.openxmlformats.org/drawingml/2006/picture">
                 <pic:pic>
                   <pic:nvPicPr>
-                    <pic:cNvPr id="0" name="image9.png"/>
+                    <pic:cNvPr id="0" name="image8.png"/>
                     <pic:cNvPicPr preferRelativeResize="0"/>
                   </pic:nvPicPr>
                   <pic:blipFill>
@@ -8656,6 +8774,32 @@
             </a:graphic>
           </wp:inline>
         </w:drawing>
+      </w:r>
+      <w:r>
+        <w:rPr>
+          <w:rtl w:val="0"/>
+        </w:rPr>
+      </w:r>
+    </w:p>
+    <w:p>
+      <w:pPr>
+        <w:spacing w:after="160" w:before="40" w:line="240" w:lineRule="auto"/>
+        <w:jc w:val="center"/>
+        <w:rPr>
+          <w:rFonts w:ascii="Calibri" w:cs="Calibri" w:eastAsia="Calibri" w:hAnsi="Calibri"/>
+        </w:rPr>
+      </w:pPr>
+      <w:r>
+        <w:rPr>
+          <w:rFonts w:ascii="Calibri" w:cs="Calibri" w:eastAsia="Calibri" w:hAnsi="Calibri"/>
+          <w:i w:val="1"/>
+          <w:iCs w:val="1"/>
+          <w:color w:val="555555"/>
+          <w:sz w:val="19"/>
+          <w:szCs w:val="19"/>
+          <w:rtl w:val="0"/>
+        </w:rPr>
+        <w:t xml:space="preserve">Figure 6: Interest Rate Model Diagnostics — 4-Panel Residual Plot (R² = 0.222, RMSE = 2.53)</w:t>
       </w:r>
       <w:r>
         <w:rPr>
@@ -10307,12 +10451,12 @@
           <wp:inline distB="114300" distT="114300" distL="114300" distR="114300">
             <wp:extent cx="6401466" cy="1955295"/>
             <wp:effectExtent b="0" l="0" r="0" t="0"/>
-            <wp:docPr id="8" name="image8.png"/>
+            <wp:docPr id="8" name="image7.png"/>
             <a:graphic>
               <a:graphicData uri="http://schemas.openxmlformats.org/drawingml/2006/picture">
                 <pic:pic>
                   <pic:nvPicPr>
-                    <pic:cNvPr id="0" name="image8.png"/>
+                    <pic:cNvPr id="0" name="image7.png"/>
                     <pic:cNvPicPr preferRelativeResize="0"/>
                   </pic:nvPicPr>
                   <pic:blipFill>
@@ -10335,6 +10479,29 @@
             </a:graphic>
           </wp:inline>
         </w:drawing>
+      </w:r>
+      <w:r>
+        <w:rPr>
+          <w:rtl w:val="0"/>
+        </w:rPr>
+      </w:r>
+    </w:p>
+    <w:p>
+      <w:pPr>
+        <w:spacing w:after="160" w:before="40" w:lineRule="auto"/>
+        <w:jc w:val="center"/>
+        <w:rPr/>
+      </w:pPr>
+      <w:r>
+        <w:rPr>
+          <w:i w:val="1"/>
+          <w:iCs w:val="1"/>
+          <w:color w:val="555555"/>
+          <w:sz w:val="19"/>
+          <w:szCs w:val="19"/>
+          <w:rtl w:val="0"/>
+        </w:rPr>
+        <w:t xml:space="preserve">Figure 7: Predicted vs. Actual Plots — Loan Amount (R²=0.198), Loan % Income (R²=0.092), Interest Rate (R²=0.222)</w:t>
       </w:r>
       <w:r>
         <w:rPr>
@@ -11548,12 +11715,12 @@
           <wp:inline distB="114300" distT="114300" distL="114300" distR="114300">
             <wp:extent cx="6134414" cy="2137487"/>
             <wp:effectExtent b="0" l="0" r="0" t="0"/>
-            <wp:docPr id="9" name="image3.png"/>
+            <wp:docPr id="9" name="image6.png"/>
             <a:graphic>
               <a:graphicData uri="http://schemas.openxmlformats.org/drawingml/2006/picture">
                 <pic:pic>
                   <pic:nvPicPr>
-                    <pic:cNvPr id="0" name="image3.png"/>
+                    <pic:cNvPr id="0" name="image6.png"/>
                     <pic:cNvPicPr preferRelativeResize="0"/>
                   </pic:nvPicPr>
                   <pic:blipFill>
@@ -11577,6 +11744,40 @@
           </wp:inline>
         </w:drawing>
       </w:r>
+      <w:r>
+        <w:rPr>
+          <w:rtl w:val="0"/>
+        </w:rPr>
+      </w:r>
+    </w:p>
+    <w:p>
+      <w:pPr>
+        <w:spacing w:after="160" w:before="40" w:lineRule="auto"/>
+        <w:jc w:val="center"/>
+        <w:rPr>
+          <w:i w:val="1"/>
+          <w:iCs w:val="1"/>
+          <w:color w:val="555555"/>
+          <w:sz w:val="19"/>
+          <w:szCs w:val="19"/>
+        </w:rPr>
+      </w:pPr>
+      <w:r>
+        <w:rPr>
+          <w:i w:val="1"/>
+          <w:iCs w:val="1"/>
+          <w:color w:val="555555"/>
+          <w:sz w:val="19"/>
+          <w:szCs w:val="19"/>
+          <w:rtl w:val="0"/>
+        </w:rPr>
+        <w:t xml:space="preserve">Figure 8: Interest Rate Prediction Error by Loan Grade (left) and Average Interest Rate by Loan Grade (right)</w:t>
+      </w:r>
+    </w:p>
+    <w:p>
+      <w:pPr>
+        <w:rPr/>
+      </w:pPr>
       <w:r>
         <w:rPr>
           <w:rtl w:val="0"/>
@@ -13584,6 +13785,29 @@
             </a:graphic>
           </wp:inline>
         </w:drawing>
+      </w:r>
+      <w:r>
+        <w:rPr>
+          <w:rtl w:val="0"/>
+        </w:rPr>
+      </w:r>
+    </w:p>
+    <w:p>
+      <w:pPr>
+        <w:spacing w:after="160" w:before="40" w:lineRule="auto"/>
+        <w:jc w:val="center"/>
+        <w:rPr/>
+      </w:pPr>
+      <w:r>
+        <w:rPr>
+          <w:i w:val="1"/>
+          <w:iCs w:val="1"/>
+          <w:color w:val="555555"/>
+          <w:sz w:val="19"/>
+          <w:szCs w:val="19"/>
+          <w:rtl w:val="0"/>
+        </w:rPr>
+        <w:t xml:space="preserve">Figure 9: SHAP Feature Importance — Interest Rate Prediction (Top 15 Features)</w:t>
       </w:r>
       <w:r>
         <w:rPr>

</xml_diff>